<commit_message>
Update 7/29 report with the cleaning ablation
Revises the report to match the ablation in 001da97:

- Headline cleaning gain +1.50 -> +1.43 pp (per-subject scale reference, the
  corrected default), and variance stated as +-0.30 -> +-0.16.
- New table in section 6 decomposing cleaning into trim-only, rescale-only, and
  both, with the finding that trimming is the active ingredient while rescaling
  alone is slightly negative and only pays off on top of trimming.
- New paragraph documenting the scale-reference confound as tested and ruled
  out (0.07 pp, inside seed noise), and noting S01/S07 are genuinely unhelped
  rather than artifacts of the reference choice.
- Per-subject table updated to per-subject-reference numbers.
- Recommendation reworded to "adopt the cleaned inputs, trimming first".
- Section 7 status table and section 9 reproducibility list updated.

Co-Authored-By: Claude Opus 5 <noreply@anthropic.com>
</commit_message>
<xml_diff>
--- a/Progress Reports/7_29 Progress Report.docx
+++ b/Progress Reports/7_29 Progress Report.docx
@@ -119,14 +119,14 @@
           <w:sz w:val="22"/>
           <w:szCs w:val="22"/>
         </w:rPr>
-        <w:t xml:space="preserve">Cleaning the inputs helps. </w:t>
+        <w:t xml:space="preserve">Cleaning the inputs helps, and trimming is the active ingredient. </w:t>
       </w:r>
       <w:r>
         <w:rPr>
           <w:sz w:val="22"/>
           <w:szCs w:val="22"/>
         </w:rPr>
-        <w:t xml:space="preserve">Trimming the pre-onset dead ticks and normalizing scale across sessions raises the copilot's open-loop gain from +1.10 to +1.50 pp and halves its across-seed variance (±0.30 → ±0.13).</w:t>
+        <w:t xml:space="preserve">Trimming the pre-onset dead ticks and normalizing scale across sessions together raise the copilot's open-loop gain from +1.10 to +1.43 pp and cut its across-seed variance in half (±0.30 → ±0.16). An ablation separates the two steps the meeting named: trimming does the work, session rescaling on its own is slightly negative, and the two interact — rescaling only becomes useful once the dead ticks are gone.</w:t>
       </w:r>
     </w:p>
     <w:p>
@@ -3767,7 +3767,7 @@
                 <w:sz w:val="20"/>
                 <w:szCs w:val="20"/>
               </w:rPr>
-              <w:t xml:space="preserve">64.23%</w:t>
+              <w:t xml:space="preserve">64.16%</w:t>
             </w:r>
           </w:p>
         </w:tc>
@@ -3794,7 +3794,7 @@
                 <w:sz w:val="20"/>
                 <w:szCs w:val="20"/>
               </w:rPr>
-              <w:t xml:space="preserve">+1.50 ± 0.13 pp</w:t>
+              <w:t xml:space="preserve">+1.43 ± 0.16 pp</w:t>
             </w:r>
           </w:p>
         </w:tc>
@@ -3814,7 +3814,609 @@
           <w:sz w:val="22"/>
           <w:szCs w:val="22"/>
         </w:rPr>
-        <w:t xml:space="preserve">Cleaning raises the gain by +0.40 pp and halves its across-seed variance. The raw-input figure of +1.10 pp reproduces the historically reported "+1 pp", now on the corrected trial set. (The 62.73% baseline here is over held-out test blocks only; the 64.0% in §3 is over all trials.)</w:t>
+        <w:t xml:space="preserve">Cleaning raises the gain by +0.33 pp and cuts its across-seed variance in half. The raw-input figure of +1.10 pp reproduces the historically reported "+1 pp", now on the corrected trial set. (The 62.73% baseline here is over held-out test blocks only; the 64.0% in §3 is over all trials.)</w:t>
+      </w:r>
+    </w:p>
+    <w:p>
+      <w:pPr>
+        <w:spacing w:after="120" w:line="276"/>
+      </w:pPr>
+      <w:r>
+        <w:rPr>
+          <w:sz w:val="22"/>
+          <w:szCs w:val="22"/>
+        </w:rPr>
+        <w:t xml:space="preserve">Because the meeting named trimming and session normalization as two separate items, the two were then ablated apart — six variants, same protocol, three seeds:</w:t>
+      </w:r>
+    </w:p>
+    <w:tbl>
+      <w:tblPr>
+        <w:tblW w:type="dxa" w:w="9360"/>
+        <w:tblBorders>
+          <w:top w:val="single" w:color="auto" w:sz="4"/>
+          <w:left w:val="single" w:color="auto" w:sz="4"/>
+          <w:bottom w:val="single" w:color="auto" w:sz="4"/>
+          <w:right w:val="single" w:color="auto" w:sz="4"/>
+          <w:insideH w:val="single" w:color="auto" w:sz="4"/>
+          <w:insideV w:val="single" w:color="auto" w:sz="4"/>
+        </w:tblBorders>
+      </w:tblPr>
+      <w:tblGrid>
+        <w:gridCol w:w="3000"/>
+        <w:gridCol w:w="1900"/>
+        <w:gridCol w:w="2400"/>
+        <w:gridCol w:w="2060"/>
+      </w:tblGrid>
+      <w:tr>
+        <w:trPr>
+          <w:tblHeader/>
+        </w:trPr>
+        <w:tc>
+          <w:tcPr>
+            <w:tcW w:type="dxa" w:w="3000"/>
+            <w:shd w:fill="E8EDF3" w:color="auto" w:val="clear"/>
+            <w:tcMar>
+              <w:top w:type="dxa" w:w="60"/>
+              <w:left w:type="dxa" w:w="100"/>
+              <w:bottom w:type="dxa" w:w="60"/>
+              <w:right w:type="dxa" w:w="100"/>
+            </w:tcMar>
+          </w:tcPr>
+          <w:p>
+            <w:pPr>
+              <w:spacing w:after="0" w:line="240"/>
+              <w:jc w:val="left"/>
+            </w:pPr>
+            <w:r>
+              <w:rPr>
+                <w:b/>
+                <w:bCs/>
+                <w:sz w:val="20"/>
+                <w:szCs w:val="20"/>
+              </w:rPr>
+              <w:t xml:space="preserve">Variant</w:t>
+            </w:r>
+          </w:p>
+        </w:tc>
+        <w:tc>
+          <w:tcPr>
+            <w:tcW w:type="dxa" w:w="1900"/>
+            <w:shd w:fill="E8EDF3" w:color="auto" w:val="clear"/>
+            <w:tcMar>
+              <w:top w:type="dxa" w:w="60"/>
+              <w:left w:type="dxa" w:w="100"/>
+              <w:bottom w:type="dxa" w:w="60"/>
+              <w:right w:type="dxa" w:w="100"/>
+            </w:tcMar>
+          </w:tcPr>
+          <w:p>
+            <w:pPr>
+              <w:spacing w:after="0" w:line="240"/>
+              <w:jc w:val="center"/>
+            </w:pPr>
+            <w:r>
+              <w:rPr>
+                <w:b/>
+                <w:bCs/>
+                <w:sz w:val="20"/>
+                <w:szCs w:val="20"/>
+              </w:rPr>
+              <w:t xml:space="preserve">copilot</w:t>
+            </w:r>
+          </w:p>
+        </w:tc>
+        <w:tc>
+          <w:tcPr>
+            <w:tcW w:type="dxa" w:w="2400"/>
+            <w:shd w:fill="E8EDF3" w:color="auto" w:val="clear"/>
+            <w:tcMar>
+              <w:top w:type="dxa" w:w="60"/>
+              <w:left w:type="dxa" w:w="100"/>
+              <w:bottom w:type="dxa" w:w="60"/>
+              <w:right w:type="dxa" w:w="100"/>
+            </w:tcMar>
+          </w:tcPr>
+          <w:p>
+            <w:pPr>
+              <w:spacing w:after="0" w:line="240"/>
+              <w:jc w:val="center"/>
+            </w:pPr>
+            <w:r>
+              <w:rPr>
+                <w:b/>
+                <w:bCs/>
+                <w:sz w:val="20"/>
+                <w:szCs w:val="20"/>
+              </w:rPr>
+              <w:t xml:space="preserve">gain</w:t>
+            </w:r>
+          </w:p>
+        </w:tc>
+        <w:tc>
+          <w:tcPr>
+            <w:tcW w:type="dxa" w:w="2060"/>
+            <w:shd w:fill="E8EDF3" w:color="auto" w:val="clear"/>
+            <w:tcMar>
+              <w:top w:type="dxa" w:w="60"/>
+              <w:left w:type="dxa" w:w="100"/>
+              <w:bottom w:type="dxa" w:w="60"/>
+              <w:right w:type="dxa" w:w="100"/>
+            </w:tcMar>
+          </w:tcPr>
+          <w:p>
+            <w:pPr>
+              <w:spacing w:after="0" w:line="240"/>
+              <w:jc w:val="center"/>
+            </w:pPr>
+            <w:r>
+              <w:rPr>
+                <w:b/>
+                <w:bCs/>
+                <w:sz w:val="20"/>
+                <w:szCs w:val="20"/>
+              </w:rPr>
+              <w:t xml:space="preserve">vs raw</w:t>
+            </w:r>
+          </w:p>
+        </w:tc>
+      </w:tr>
+      <w:tr>
+        <w:tc>
+          <w:tcPr>
+            <w:tcW w:type="dxa" w:w="3000"/>
+            <w:tcMar>
+              <w:top w:type="dxa" w:w="60"/>
+              <w:left w:type="dxa" w:w="100"/>
+              <w:bottom w:type="dxa" w:w="60"/>
+              <w:right w:type="dxa" w:w="100"/>
+            </w:tcMar>
+          </w:tcPr>
+          <w:p>
+            <w:pPr>
+              <w:spacing w:after="0" w:line="240"/>
+              <w:jc w:val="left"/>
+            </w:pPr>
+            <w:r>
+              <w:rPr>
+                <w:b w:val="false"/>
+                <w:bCs w:val="false"/>
+                <w:sz w:val="20"/>
+                <w:szCs w:val="20"/>
+              </w:rPr>
+              <w:t xml:space="preserve">raw (no cleaning)</w:t>
+            </w:r>
+          </w:p>
+        </w:tc>
+        <w:tc>
+          <w:tcPr>
+            <w:tcW w:type="dxa" w:w="1900"/>
+            <w:tcMar>
+              <w:top w:type="dxa" w:w="60"/>
+              <w:left w:type="dxa" w:w="100"/>
+              <w:bottom w:type="dxa" w:w="60"/>
+              <w:right w:type="dxa" w:w="100"/>
+            </w:tcMar>
+          </w:tcPr>
+          <w:p>
+            <w:pPr>
+              <w:spacing w:after="0" w:line="240"/>
+              <w:jc w:val="center"/>
+            </w:pPr>
+            <w:r>
+              <w:rPr>
+                <w:b w:val="false"/>
+                <w:bCs w:val="false"/>
+                <w:sz w:val="20"/>
+                <w:szCs w:val="20"/>
+              </w:rPr>
+              <w:t xml:space="preserve">63.83%</w:t>
+            </w:r>
+          </w:p>
+        </w:tc>
+        <w:tc>
+          <w:tcPr>
+            <w:tcW w:type="dxa" w:w="2400"/>
+            <w:tcMar>
+              <w:top w:type="dxa" w:w="60"/>
+              <w:left w:type="dxa" w:w="100"/>
+              <w:bottom w:type="dxa" w:w="60"/>
+              <w:right w:type="dxa" w:w="100"/>
+            </w:tcMar>
+          </w:tcPr>
+          <w:p>
+            <w:pPr>
+              <w:spacing w:after="0" w:line="240"/>
+              <w:jc w:val="center"/>
+            </w:pPr>
+            <w:r>
+              <w:rPr>
+                <w:b w:val="false"/>
+                <w:bCs w:val="false"/>
+                <w:sz w:val="20"/>
+                <w:szCs w:val="20"/>
+              </w:rPr>
+              <w:t xml:space="preserve">+1.10 ± 0.30</w:t>
+            </w:r>
+          </w:p>
+        </w:tc>
+        <w:tc>
+          <w:tcPr>
+            <w:tcW w:type="dxa" w:w="2060"/>
+            <w:tcMar>
+              <w:top w:type="dxa" w:w="60"/>
+              <w:left w:type="dxa" w:w="100"/>
+              <w:bottom w:type="dxa" w:w="60"/>
+              <w:right w:type="dxa" w:w="100"/>
+            </w:tcMar>
+          </w:tcPr>
+          <w:p>
+            <w:pPr>
+              <w:spacing w:after="0" w:line="240"/>
+              <w:jc w:val="center"/>
+            </w:pPr>
+            <w:r>
+              <w:rPr>
+                <w:b w:val="false"/>
+                <w:bCs w:val="false"/>
+                <w:sz w:val="20"/>
+                <w:szCs w:val="20"/>
+              </w:rPr>
+              <w:t xml:space="preserve">—</w:t>
+            </w:r>
+          </w:p>
+        </w:tc>
+      </w:tr>
+      <w:tr>
+        <w:tc>
+          <w:tcPr>
+            <w:tcW w:type="dxa" w:w="3000"/>
+            <w:shd w:fill="FFF4E0" w:color="auto" w:val="clear"/>
+            <w:tcMar>
+              <w:top w:type="dxa" w:w="60"/>
+              <w:left w:type="dxa" w:w="100"/>
+              <w:bottom w:type="dxa" w:w="60"/>
+              <w:right w:type="dxa" w:w="100"/>
+            </w:tcMar>
+          </w:tcPr>
+          <w:p>
+            <w:pPr>
+              <w:spacing w:after="0" w:line="240"/>
+              <w:jc w:val="left"/>
+            </w:pPr>
+            <w:r>
+              <w:rPr>
+                <w:b/>
+                <w:bCs/>
+                <w:sz w:val="20"/>
+                <w:szCs w:val="20"/>
+              </w:rPr>
+              <w:t xml:space="preserve">trim only</w:t>
+            </w:r>
+          </w:p>
+        </w:tc>
+        <w:tc>
+          <w:tcPr>
+            <w:tcW w:type="dxa" w:w="1900"/>
+            <w:shd w:fill="FFF4E0" w:color="auto" w:val="clear"/>
+            <w:tcMar>
+              <w:top w:type="dxa" w:w="60"/>
+              <w:left w:type="dxa" w:w="100"/>
+              <w:bottom w:type="dxa" w:w="60"/>
+              <w:right w:type="dxa" w:w="100"/>
+            </w:tcMar>
+          </w:tcPr>
+          <w:p>
+            <w:pPr>
+              <w:spacing w:after="0" w:line="240"/>
+              <w:jc w:val="center"/>
+            </w:pPr>
+            <w:r>
+              <w:rPr>
+                <w:b/>
+                <w:bCs/>
+                <w:sz w:val="20"/>
+                <w:szCs w:val="20"/>
+              </w:rPr>
+              <w:t xml:space="preserve">63.99%</w:t>
+            </w:r>
+          </w:p>
+        </w:tc>
+        <w:tc>
+          <w:tcPr>
+            <w:tcW w:type="dxa" w:w="2400"/>
+            <w:shd w:fill="FFF4E0" w:color="auto" w:val="clear"/>
+            <w:tcMar>
+              <w:top w:type="dxa" w:w="60"/>
+              <w:left w:type="dxa" w:w="100"/>
+              <w:bottom w:type="dxa" w:w="60"/>
+              <w:right w:type="dxa" w:w="100"/>
+            </w:tcMar>
+          </w:tcPr>
+          <w:p>
+            <w:pPr>
+              <w:spacing w:after="0" w:line="240"/>
+              <w:jc w:val="center"/>
+            </w:pPr>
+            <w:r>
+              <w:rPr>
+                <w:b/>
+                <w:bCs/>
+                <w:sz w:val="20"/>
+                <w:szCs w:val="20"/>
+              </w:rPr>
+              <w:t xml:space="preserve">+1.27 ± 0.17</w:t>
+            </w:r>
+          </w:p>
+        </w:tc>
+        <w:tc>
+          <w:tcPr>
+            <w:tcW w:type="dxa" w:w="2060"/>
+            <w:shd w:fill="FFF4E0" w:color="auto" w:val="clear"/>
+            <w:tcMar>
+              <w:top w:type="dxa" w:w="60"/>
+              <w:left w:type="dxa" w:w="100"/>
+              <w:bottom w:type="dxa" w:w="60"/>
+              <w:right w:type="dxa" w:w="100"/>
+            </w:tcMar>
+          </w:tcPr>
+          <w:p>
+            <w:pPr>
+              <w:spacing w:after="0" w:line="240"/>
+              <w:jc w:val="center"/>
+            </w:pPr>
+            <w:r>
+              <w:rPr>
+                <w:b/>
+                <w:bCs/>
+                <w:sz w:val="20"/>
+                <w:szCs w:val="20"/>
+              </w:rPr>
+              <w:t xml:space="preserve">+0.17</w:t>
+            </w:r>
+          </w:p>
+        </w:tc>
+      </w:tr>
+      <w:tr>
+        <w:tc>
+          <w:tcPr>
+            <w:tcW w:type="dxa" w:w="3000"/>
+            <w:tcMar>
+              <w:top w:type="dxa" w:w="60"/>
+              <w:left w:type="dxa" w:w="100"/>
+              <w:bottom w:type="dxa" w:w="60"/>
+              <w:right w:type="dxa" w:w="100"/>
+            </w:tcMar>
+          </w:tcPr>
+          <w:p>
+            <w:pPr>
+              <w:spacing w:after="0" w:line="240"/>
+              <w:jc w:val="left"/>
+            </w:pPr>
+            <w:r>
+              <w:rPr>
+                <w:b w:val="false"/>
+                <w:bCs w:val="false"/>
+                <w:sz w:val="20"/>
+                <w:szCs w:val="20"/>
+              </w:rPr>
+              <w:t xml:space="preserve">session rescale only</w:t>
+            </w:r>
+          </w:p>
+        </w:tc>
+        <w:tc>
+          <w:tcPr>
+            <w:tcW w:type="dxa" w:w="1900"/>
+            <w:tcMar>
+              <w:top w:type="dxa" w:w="60"/>
+              <w:left w:type="dxa" w:w="100"/>
+              <w:bottom w:type="dxa" w:w="60"/>
+              <w:right w:type="dxa" w:w="100"/>
+            </w:tcMar>
+          </w:tcPr>
+          <w:p>
+            <w:pPr>
+              <w:spacing w:after="0" w:line="240"/>
+              <w:jc w:val="center"/>
+            </w:pPr>
+            <w:r>
+              <w:rPr>
+                <w:b w:val="false"/>
+                <w:bCs w:val="false"/>
+                <w:sz w:val="20"/>
+                <w:szCs w:val="20"/>
+              </w:rPr>
+              <w:t xml:space="preserve">63.59%</w:t>
+            </w:r>
+          </w:p>
+        </w:tc>
+        <w:tc>
+          <w:tcPr>
+            <w:tcW w:type="dxa" w:w="2400"/>
+            <w:tcMar>
+              <w:top w:type="dxa" w:w="60"/>
+              <w:left w:type="dxa" w:w="100"/>
+              <w:bottom w:type="dxa" w:w="60"/>
+              <w:right w:type="dxa" w:w="100"/>
+            </w:tcMar>
+          </w:tcPr>
+          <w:p>
+            <w:pPr>
+              <w:spacing w:after="0" w:line="240"/>
+              <w:jc w:val="center"/>
+            </w:pPr>
+            <w:r>
+              <w:rPr>
+                <w:b w:val="false"/>
+                <w:bCs w:val="false"/>
+                <w:sz w:val="20"/>
+                <w:szCs w:val="20"/>
+              </w:rPr>
+              <w:t xml:space="preserve">+0.86 ± 0.49</w:t>
+            </w:r>
+          </w:p>
+        </w:tc>
+        <w:tc>
+          <w:tcPr>
+            <w:tcW w:type="dxa" w:w="2060"/>
+            <w:tcMar>
+              <w:top w:type="dxa" w:w="60"/>
+              <w:left w:type="dxa" w:w="100"/>
+              <w:bottom w:type="dxa" w:w="60"/>
+              <w:right w:type="dxa" w:w="100"/>
+            </w:tcMar>
+          </w:tcPr>
+          <w:p>
+            <w:pPr>
+              <w:spacing w:after="0" w:line="240"/>
+              <w:jc w:val="center"/>
+            </w:pPr>
+            <w:r>
+              <w:rPr>
+                <w:b w:val="false"/>
+                <w:bCs w:val="false"/>
+                <w:sz w:val="20"/>
+                <w:szCs w:val="20"/>
+              </w:rPr>
+              <w:t xml:space="preserve">−0.24</w:t>
+            </w:r>
+          </w:p>
+        </w:tc>
+      </w:tr>
+      <w:tr>
+        <w:tc>
+          <w:tcPr>
+            <w:tcW w:type="dxa" w:w="3000"/>
+            <w:shd w:fill="FFF4E0" w:color="auto" w:val="clear"/>
+            <w:tcMar>
+              <w:top w:type="dxa" w:w="60"/>
+              <w:left w:type="dxa" w:w="100"/>
+              <w:bottom w:type="dxa" w:w="60"/>
+              <w:right w:type="dxa" w:w="100"/>
+            </w:tcMar>
+          </w:tcPr>
+          <w:p>
+            <w:pPr>
+              <w:spacing w:after="0" w:line="240"/>
+              <w:jc w:val="left"/>
+            </w:pPr>
+            <w:r>
+              <w:rPr>
+                <w:b/>
+                <w:bCs/>
+                <w:sz w:val="20"/>
+                <w:szCs w:val="20"/>
+              </w:rPr>
+              <w:t xml:space="preserve">trim + rescale</w:t>
+            </w:r>
+          </w:p>
+        </w:tc>
+        <w:tc>
+          <w:tcPr>
+            <w:tcW w:type="dxa" w:w="1900"/>
+            <w:shd w:fill="FFF4E0" w:color="auto" w:val="clear"/>
+            <w:tcMar>
+              <w:top w:type="dxa" w:w="60"/>
+              <w:left w:type="dxa" w:w="100"/>
+              <w:bottom w:type="dxa" w:w="60"/>
+              <w:right w:type="dxa" w:w="100"/>
+            </w:tcMar>
+          </w:tcPr>
+          <w:p>
+            <w:pPr>
+              <w:spacing w:after="0" w:line="240"/>
+              <w:jc w:val="center"/>
+            </w:pPr>
+            <w:r>
+              <w:rPr>
+                <w:b/>
+                <w:bCs/>
+                <w:sz w:val="20"/>
+                <w:szCs w:val="20"/>
+              </w:rPr>
+              <w:t xml:space="preserve">64.16%</w:t>
+            </w:r>
+          </w:p>
+        </w:tc>
+        <w:tc>
+          <w:tcPr>
+            <w:tcW w:type="dxa" w:w="2400"/>
+            <w:shd w:fill="FFF4E0" w:color="auto" w:val="clear"/>
+            <w:tcMar>
+              <w:top w:type="dxa" w:w="60"/>
+              <w:left w:type="dxa" w:w="100"/>
+              <w:bottom w:type="dxa" w:w="60"/>
+              <w:right w:type="dxa" w:w="100"/>
+            </w:tcMar>
+          </w:tcPr>
+          <w:p>
+            <w:pPr>
+              <w:spacing w:after="0" w:line="240"/>
+              <w:jc w:val="center"/>
+            </w:pPr>
+            <w:r>
+              <w:rPr>
+                <w:b/>
+                <w:bCs/>
+                <w:sz w:val="20"/>
+                <w:szCs w:val="20"/>
+              </w:rPr>
+              <w:t xml:space="preserve">+1.43 ± 0.16</w:t>
+            </w:r>
+          </w:p>
+        </w:tc>
+        <w:tc>
+          <w:tcPr>
+            <w:tcW w:type="dxa" w:w="2060"/>
+            <w:shd w:fill="FFF4E0" w:color="auto" w:val="clear"/>
+            <w:tcMar>
+              <w:top w:type="dxa" w:w="60"/>
+              <w:left w:type="dxa" w:w="100"/>
+              <w:bottom w:type="dxa" w:w="60"/>
+              <w:right w:type="dxa" w:w="100"/>
+            </w:tcMar>
+          </w:tcPr>
+          <w:p>
+            <w:pPr>
+              <w:spacing w:after="0" w:line="240"/>
+              <w:jc w:val="center"/>
+            </w:pPr>
+            <w:r>
+              <w:rPr>
+                <w:b/>
+                <w:bCs/>
+                <w:sz w:val="20"/>
+                <w:szCs w:val="20"/>
+              </w:rPr>
+              <w:t xml:space="preserve">+0.33</w:t>
+            </w:r>
+          </w:p>
+        </w:tc>
+      </w:tr>
+    </w:tbl>
+    <w:p>
+      <w:pPr>
+        <w:spacing w:after="120"/>
+      </w:pPr>
+    </w:p>
+    <w:p>
+      <w:pPr>
+        <w:spacing w:after="120" w:line="276"/>
+      </w:pPr>
+      <w:r>
+        <w:rPr>
+          <w:b/>
+          <w:bCs/>
+          <w:sz w:val="22"/>
+          <w:szCs w:val="22"/>
+        </w:rPr>
+        <w:t xml:space="preserve">Trimming is the active ingredient; rescaling only pays off on top of it. </w:t>
+      </w:r>
+      <w:r>
+        <w:rPr>
+          <w:sz w:val="22"/>
+          <w:szCs w:val="22"/>
+        </w:rPr>
+        <w:t xml:space="preserve">Trimming alone gives +0.17 pp and sharply stabilizes the estimate (±0.30 → ±0.17). Session rescaling alone is slightly negative (−0.24 pp) and the noisiest variant of all (±0.49). Yet together they give +0.33 pp — more than the sum of the parts. The two interact: only after the pre-onset dwell is removed is each session's scale estimated from ticks that actually reflect movement, which is what makes the normalization meaningful rather than noise-driven. The practical guidance is that trimming should be adopted on its own merits, and rescaling should not be applied without it.</w:t>
       </w:r>
     </w:p>
     <w:p>
@@ -4057,7 +4659,7 @@
                 <w:sz w:val="20"/>
                 <w:szCs w:val="20"/>
               </w:rPr>
-              <w:t xml:space="preserve">+2.8</w:t>
+              <w:t xml:space="preserve">+2.80</w:t>
             </w:r>
           </w:p>
         </w:tc>
@@ -4081,7 +4683,7 @@
                 <w:sz w:val="20"/>
                 <w:szCs w:val="20"/>
               </w:rPr>
-              <w:t xml:space="preserve">+5.3</w:t>
+              <w:t xml:space="preserve">+5.51</w:t>
             </w:r>
           </w:p>
         </w:tc>
@@ -4105,7 +4707,7 @@
                 <w:sz w:val="20"/>
                 <w:szCs w:val="20"/>
               </w:rPr>
-              <w:t xml:space="preserve">+2.5</w:t>
+              <w:t xml:space="preserve">+2.71</w:t>
             </w:r>
           </w:p>
         </w:tc>
@@ -4182,7 +4784,7 @@
                 <w:sz w:val="20"/>
                 <w:szCs w:val="20"/>
               </w:rPr>
-              <w:t xml:space="preserve">−0.5</w:t>
+              <w:t xml:space="preserve">−0.49</w:t>
             </w:r>
           </w:p>
         </w:tc>
@@ -4207,7 +4809,7 @@
                 <w:sz w:val="20"/>
                 <w:szCs w:val="20"/>
               </w:rPr>
-              <w:t xml:space="preserve">+0.6</w:t>
+              <w:t xml:space="preserve">+0.49</w:t>
             </w:r>
           </w:p>
         </w:tc>
@@ -4232,7 +4834,7 @@
                 <w:sz w:val="20"/>
                 <w:szCs w:val="20"/>
               </w:rPr>
-              <w:t xml:space="preserve">+1.1</w:t>
+              <w:t xml:space="preserve">+0.98</w:t>
             </w:r>
           </w:p>
         </w:tc>
@@ -4306,7 +4908,7 @@
                 <w:sz w:val="20"/>
                 <w:szCs w:val="20"/>
               </w:rPr>
-              <w:t xml:space="preserve">+2.2</w:t>
+              <w:t xml:space="preserve">+2.23</w:t>
             </w:r>
           </w:p>
         </w:tc>
@@ -4330,7 +4932,7 @@
                 <w:sz w:val="20"/>
                 <w:szCs w:val="20"/>
               </w:rPr>
-              <w:t xml:space="preserve">+2.7</w:t>
+              <w:t xml:space="preserve">+2.75</w:t>
             </w:r>
           </w:p>
         </w:tc>
@@ -4354,7 +4956,7 @@
                 <w:sz w:val="20"/>
                 <w:szCs w:val="20"/>
               </w:rPr>
-              <w:t xml:space="preserve">+0.5</w:t>
+              <w:t xml:space="preserve">+0.52</w:t>
             </w:r>
           </w:p>
         </w:tc>
@@ -4431,7 +5033,7 @@
                 <w:sz w:val="20"/>
                 <w:szCs w:val="20"/>
               </w:rPr>
-              <w:t xml:space="preserve">+1.0</w:t>
+              <w:t xml:space="preserve">+0.97</w:t>
             </w:r>
           </w:p>
         </w:tc>
@@ -4456,7 +5058,7 @@
                 <w:sz w:val="20"/>
                 <w:szCs w:val="20"/>
               </w:rPr>
-              <w:t xml:space="preserve">+1.1</w:t>
+              <w:t xml:space="preserve">+1.11</w:t>
             </w:r>
           </w:p>
         </w:tc>
@@ -4481,7 +5083,7 @@
                 <w:sz w:val="20"/>
                 <w:szCs w:val="20"/>
               </w:rPr>
-              <w:t xml:space="preserve">+0.1</w:t>
+              <w:t xml:space="preserve">+0.14</w:t>
             </w:r>
           </w:p>
         </w:tc>
@@ -4507,7 +5109,7 @@
                 <w:sz w:val="20"/>
                 <w:szCs w:val="20"/>
               </w:rPr>
-              <w:t xml:space="preserve">S01</w:t>
+              <w:t xml:space="preserve">S07</w:t>
             </w:r>
           </w:p>
         </w:tc>
@@ -4531,7 +5133,7 @@
                 <w:sz w:val="20"/>
                 <w:szCs w:val="20"/>
               </w:rPr>
-              <w:t xml:space="preserve">56.2%</w:t>
+              <w:t xml:space="preserve">53.5%</w:t>
             </w:r>
           </w:p>
         </w:tc>
@@ -4555,7 +5157,7 @@
                 <w:sz w:val="20"/>
                 <w:szCs w:val="20"/>
               </w:rPr>
-              <w:t xml:space="preserve">+0.5</w:t>
+              <w:t xml:space="preserve">−0.30</w:t>
             </w:r>
           </w:p>
         </w:tc>
@@ -4579,7 +5181,7 @@
                 <w:sz w:val="20"/>
                 <w:szCs w:val="20"/>
               </w:rPr>
-              <w:t xml:space="preserve">−0.4</w:t>
+              <w:t xml:space="preserve">−0.52</w:t>
             </w:r>
           </w:p>
         </w:tc>
@@ -4603,7 +5205,7 @@
                 <w:sz w:val="20"/>
                 <w:szCs w:val="20"/>
               </w:rPr>
-              <w:t xml:space="preserve">−0.9</w:t>
+              <w:t xml:space="preserve">−0.22</w:t>
             </w:r>
           </w:p>
         </w:tc>
@@ -4630,7 +5232,7 @@
                 <w:sz w:val="20"/>
                 <w:szCs w:val="20"/>
               </w:rPr>
-              <w:t xml:space="preserve">S07</w:t>
+              <w:t xml:space="preserve">S01</w:t>
             </w:r>
           </w:p>
         </w:tc>
@@ -4655,7 +5257,7 @@
                 <w:sz w:val="20"/>
                 <w:szCs w:val="20"/>
               </w:rPr>
-              <w:t xml:space="preserve">53.5%</w:t>
+              <w:t xml:space="preserve">56.2%</w:t>
             </w:r>
           </w:p>
         </w:tc>
@@ -4680,7 +5282,7 @@
                 <w:sz w:val="20"/>
                 <w:szCs w:val="20"/>
               </w:rPr>
-              <w:t xml:space="preserve">−0.3</w:t>
+              <w:t xml:space="preserve">+0.52</w:t>
             </w:r>
           </w:p>
         </w:tc>
@@ -4705,7 +5307,7 @@
                 <w:sz w:val="20"/>
                 <w:szCs w:val="20"/>
               </w:rPr>
-              <w:t xml:space="preserve">−0.7</w:t>
+              <w:t xml:space="preserve">−1.12</w:t>
             </w:r>
           </w:p>
         </w:tc>
@@ -4730,7 +5332,7 @@
                 <w:sz w:val="20"/>
                 <w:szCs w:val="20"/>
               </w:rPr>
-              <w:t xml:space="preserve">−0.4</w:t>
+              <w:t xml:space="preserve">−1.64</w:t>
             </w:r>
           </w:p>
         </w:tc>
@@ -4750,7 +5352,7 @@
           <w:sz w:val="22"/>
           <w:szCs w:val="22"/>
         </w:rPr>
-        <w:t xml:space="preserve">Cleaning helps the four subjects that already carry signal and is slightly negative on the two weakest (S01, S07, both near 53–56% raw accuracy). The net is positive with lower variance.</w:t>
+        <w:t xml:space="preserve">Cleaning helps the four subjects that already carry signal and is negative on two of the three weakest decoders (S01 and S07, at 56.2% and 53.5% raw). Cleaning sharpens a signal that is present; it does not create one where it is not.</w:t>
       </w:r>
     </w:p>
     <w:p>
@@ -4764,14 +5366,35 @@
           <w:sz w:val="22"/>
           <w:szCs w:val="22"/>
         </w:rPr>
-        <w:t xml:space="preserve">Honest reading. </w:t>
+        <w:t xml:space="preserve">A confound that was tested and ruled out. </w:t>
       </w:r>
       <w:r>
         <w:rPr>
           <w:sz w:val="22"/>
           <w:szCs w:val="22"/>
         </w:rPr>
-        <w:t xml:space="preserve">The effect is real but modest — +0.40 pp is roughly one standard deviation of the raw-input measurement. What makes it credible is the halved variance, the consistent direction across the signal-carrying subjects, and the S02 result (+2.8 → +5.3). It is not a step change. The additive open-loop control law still has limited headroom.</w:t>
+        <w:t xml:space="preserve">The per-session rescale needs a reference radius. Using one global reference across all subjects is equivalent to per-subject normalization times a per-subject constant, and that constant does not cancel: the copilot's corrective magnitude is an absolute 0.02 while the BCI velocity scales with it, so a global reference silently varies the copilot's effective strength by ~35% across subjects — and the two subjects it weakened most were exactly S01 and S07. Measured directly, the two references differ by 0.07 pp (+1.50 global vs +1.43 per-subject), well inside the seed noise, so the result is not an artifact of this choice and S01/S07 are genuinely unhelped. The per-subject reference is now the default regardless, since the pipeline trains one model per subject.</w:t>
+      </w:r>
+    </w:p>
+    <w:p>
+      <w:pPr>
+        <w:spacing w:after="120" w:line="276"/>
+      </w:pPr>
+      <w:r>
+        <w:rPr>
+          <w:b/>
+          <w:bCs/>
+          <w:sz w:val="22"/>
+          <w:szCs w:val="22"/>
+        </w:rPr>
+        <w:t xml:space="preserve">Honest reading. </w:t>
+      </w:r>
+      <w:r>
+        <w:rPr>
+          <w:sz w:val="22"/>
+          <w:szCs w:val="22"/>
+        </w:rPr>
+        <w:t xml:space="preserve">The effect is real but modest — +0.33 pp is about one standard deviation of the raw-input measurement. What makes it credible is the halved variance, the consistent direction across the signal-carrying subjects, and the S02 result (+2.80 → +5.51). It is not a step change. The additive open-loop control law still has limited headroom.</w:t>
       </w:r>
     </w:p>
     <w:p>
@@ -4967,7 +5590,7 @@
                 <w:sz w:val="20"/>
                 <w:szCs w:val="20"/>
               </w:rPr>
-              <w:t xml:space="preserve">Reproduced on the corrected data (+1.10 pp), and improved to +1.50 pp with cleaning.</w:t>
+              <w:t xml:space="preserve">Reproduced on the corrected data (+1.10 pp), and improved to +1.43 pp with cleaning.</w:t>
             </w:r>
           </w:p>
         </w:tc>
@@ -5193,14 +5816,14 @@
           <w:sz w:val="22"/>
           <w:szCs w:val="22"/>
         </w:rPr>
-        <w:t xml:space="preserve">Adopt the cleaned inputs. </w:t>
+        <w:t xml:space="preserve">Adopt the cleaned inputs, trimming first. </w:t>
       </w:r>
       <w:r>
         <w:rPr>
           <w:sz w:val="22"/>
           <w:szCs w:val="22"/>
         </w:rPr>
-        <w:t xml:space="preserve">cleaning is metric-safe, improves the gain, and halves its variance. It should become the default input path for all subsequent work.</w:t>
+        <w:t xml:space="preserve">cleaning is metric-safe, improves the gain, and halves its variance. It should become the default input path for all subsequent work. Note the asymmetry from §6: trimming carries the benefit and should be adopted unconditionally, while session rescaling should only ever be applied on top of trimming — alone it is slightly harmful.</w:t>
       </w:r>
     </w:p>
     <w:p>
@@ -5546,7 +6169,7 @@
                 <w:sz w:val="20"/>
                 <w:szCs w:val="20"/>
               </w:rPr>
-              <w:t xml:space="preserve">copilot_dataset.py</w:t>
+              <w:t xml:space="preserve">ablate_cleaning.py</w:t>
             </w:r>
           </w:p>
         </w:tc>
@@ -5554,6 +6177,56 @@
           <w:tcPr>
             <w:tcW w:type="dxa" w:w="6460"/>
             <w:shd w:fill="F7F9FB" w:color="auto" w:val="clear"/>
+            <w:tcMar>
+              <w:top w:type="dxa" w:w="60"/>
+              <w:left w:type="dxa" w:w="100"/>
+              <w:bottom w:type="dxa" w:w="60"/>
+              <w:right w:type="dxa" w:w="100"/>
+            </w:tcMar>
+          </w:tcPr>
+          <w:p>
+            <w:pPr>
+              <w:spacing w:after="0" w:line="240"/>
+              <w:jc w:val="center"/>
+            </w:pPr>
+            <w:r>
+              <w:rPr>
+                <w:sz w:val="20"/>
+                <w:szCs w:val="20"/>
+              </w:rPr>
+              <w:t xml:space="preserve">§6 — trim vs rescale decomposition, and the scale-reference check</w:t>
+            </w:r>
+          </w:p>
+        </w:tc>
+      </w:tr>
+      <w:tr>
+        <w:tc>
+          <w:tcPr>
+            <w:tcW w:type="dxa" w:w="2900"/>
+            <w:tcMar>
+              <w:top w:type="dxa" w:w="60"/>
+              <w:left w:type="dxa" w:w="100"/>
+              <w:bottom w:type="dxa" w:w="60"/>
+              <w:right w:type="dxa" w:w="100"/>
+            </w:tcMar>
+          </w:tcPr>
+          <w:p>
+            <w:pPr>
+              <w:spacing w:after="0" w:line="240"/>
+              <w:jc w:val="left"/>
+            </w:pPr>
+            <w:r>
+              <w:rPr>
+                <w:sz w:val="20"/>
+                <w:szCs w:val="20"/>
+              </w:rPr>
+              <w:t xml:space="preserve">copilot_dataset.py</w:t>
+            </w:r>
+          </w:p>
+        </w:tc>
+        <w:tc>
+          <w:tcPr>
+            <w:tcW w:type="dxa" w:w="6460"/>
             <w:tcMar>
               <w:top w:type="dxa" w:w="60"/>
               <w:left w:type="dxa" w:w="100"/>

</xml_diff>